<commit_message>
Audit rules run against wip
</commit_message>
<xml_diff>
--- a/docs/wip/CHRO_Pattern_Transition_Narrative.docx
+++ b/docs/wip/CHRO_Pattern_Transition_Narrative.docx
@@ -251,7 +251,7 @@
     </w:p>
     <w:p>
       <w:pPr>
-        <w:spacing w:after="180" w:before="0"/>
+        <w:spacing w:after="120" w:before="0"/>
       </w:pPr>
       <w:r>
         <w:rPr>
@@ -265,6 +265,276 @@
           <w:szCs w:val="16"/>
         </w:rPr>
         <w:t xml:space="preserve">Composition of CHRO's real activity mix still requiring human involvement, by HITL pattern — area = share, %</w:t>
+      </w:r>
+    </w:p>
+    <w:p>
+      <w:pPr>
+        <w:spacing w:after="40" w:before="0"/>
+      </w:pPr>
+      <w:r>
+        <w:rPr>
+          <w:rFonts w:ascii="DM Sans" w:cs="DM Sans" w:eastAsia="DM Sans" w:hAnsi="DM Sans"/>
+          <w:b/>
+          <w:bCs/>
+          <w:i w:val="false"/>
+          <w:iCs w:val="false"/>
+          <w:color w:val="21365E"/>
+          <w:sz w:val="15"/>
+          <w:szCs w:val="15"/>
+        </w:rPr>
+        <w:t xml:space="preserve">■ </w:t>
+      </w:r>
+      <w:r>
+        <w:rPr>
+          <w:rFonts w:ascii="DM Sans" w:cs="DM Sans" w:eastAsia="DM Sans" w:hAnsi="DM Sans"/>
+          <w:b/>
+          <w:bCs/>
+          <w:i w:val="false"/>
+          <w:iCs w:val="false"/>
+          <w:color w:val="1B4F8A"/>
+          <w:sz w:val="15"/>
+          <w:szCs w:val="15"/>
+        </w:rPr>
+        <w:t xml:space="preserve">Decision</w:t>
+      </w:r>
+      <w:r>
+        <w:rPr>
+          <w:rFonts w:ascii="DM Sans" w:cs="DM Sans" w:eastAsia="DM Sans" w:hAnsi="DM Sans"/>
+          <w:b w:val="false"/>
+          <w:bCs w:val="false"/>
+          <w:i/>
+          <w:iCs/>
+          <w:color w:val="888888"/>
+          <w:sz w:val="14"/>
+          <w:szCs w:val="14"/>
+        </w:rPr>
+        <w:t xml:space="preserve"> — Judgment &amp; Authority</w:t>
+      </w:r>
+      <w:r>
+        <w:rPr>
+          <w:rFonts w:ascii="DM Sans" w:cs="DM Sans" w:eastAsia="DM Sans" w:hAnsi="DM Sans"/>
+          <w:b w:val="false"/>
+          <w:bCs w:val="false"/>
+          <w:i w:val="false"/>
+          <w:iCs w:val="false"/>
+          <w:color w:val="444444"/>
+          <w:sz w:val="15"/>
+          <w:szCs w:val="15"/>
+        </w:rPr>
+        <w:t xml:space="preserve">    </w:t>
+      </w:r>
+      <w:r>
+        <w:rPr>
+          <w:rFonts w:ascii="DM Sans" w:cs="DM Sans" w:eastAsia="DM Sans" w:hAnsi="DM Sans"/>
+          <w:b/>
+          <w:bCs/>
+          <w:i w:val="false"/>
+          <w:iCs w:val="false"/>
+          <w:color w:val="5B3A9E"/>
+          <w:sz w:val="15"/>
+          <w:szCs w:val="15"/>
+        </w:rPr>
+        <w:t xml:space="preserve">■ </w:t>
+      </w:r>
+      <w:r>
+        <w:rPr>
+          <w:rFonts w:ascii="DM Sans" w:cs="DM Sans" w:eastAsia="DM Sans" w:hAnsi="DM Sans"/>
+          <w:b/>
+          <w:bCs/>
+          <w:i w:val="false"/>
+          <w:iCs w:val="false"/>
+          <w:color w:val="534AB7"/>
+          <w:sz w:val="15"/>
+          <w:szCs w:val="15"/>
+        </w:rPr>
+        <w:t xml:space="preserve">Knowledge</w:t>
+      </w:r>
+      <w:r>
+        <w:rPr>
+          <w:rFonts w:ascii="DM Sans" w:cs="DM Sans" w:eastAsia="DM Sans" w:hAnsi="DM Sans"/>
+          <w:b w:val="false"/>
+          <w:bCs w:val="false"/>
+          <w:i/>
+          <w:iCs/>
+          <w:color w:val="888888"/>
+          <w:sz w:val="14"/>
+          <w:szCs w:val="14"/>
+        </w:rPr>
+        <w:t xml:space="preserve"> — Synthesis &amp; Interpretation</w:t>
+      </w:r>
+      <w:r>
+        <w:rPr>
+          <w:rFonts w:ascii="DM Sans" w:cs="DM Sans" w:eastAsia="DM Sans" w:hAnsi="DM Sans"/>
+          <w:b w:val="false"/>
+          <w:bCs w:val="false"/>
+          <w:i w:val="false"/>
+          <w:iCs w:val="false"/>
+          <w:color w:val="444444"/>
+          <w:sz w:val="15"/>
+          <w:szCs w:val="15"/>
+        </w:rPr>
+        <w:t xml:space="preserve">    </w:t>
+      </w:r>
+      <w:r>
+        <w:rPr>
+          <w:rFonts w:ascii="DM Sans" w:cs="DM Sans" w:eastAsia="DM Sans" w:hAnsi="DM Sans"/>
+          <w:b/>
+          <w:bCs/>
+          <w:i w:val="false"/>
+          <w:iCs w:val="false"/>
+          <w:color w:val="0E7C86"/>
+          <w:sz w:val="15"/>
+          <w:szCs w:val="15"/>
+        </w:rPr>
+        <w:t xml:space="preserve">■ </w:t>
+      </w:r>
+      <w:r>
+        <w:rPr>
+          <w:rFonts w:ascii="DM Sans" w:cs="DM Sans" w:eastAsia="DM Sans" w:hAnsi="DM Sans"/>
+          <w:b/>
+          <w:bCs/>
+          <w:i w:val="false"/>
+          <w:iCs w:val="false"/>
+          <w:color w:val="0369A1"/>
+          <w:sz w:val="15"/>
+          <w:szCs w:val="15"/>
+        </w:rPr>
+        <w:t xml:space="preserve">Document</w:t>
+      </w:r>
+      <w:r>
+        <w:rPr>
+          <w:rFonts w:ascii="DM Sans" w:cs="DM Sans" w:eastAsia="DM Sans" w:hAnsi="DM Sans"/>
+          <w:b w:val="false"/>
+          <w:bCs w:val="false"/>
+          <w:i/>
+          <w:iCs/>
+          <w:color w:val="888888"/>
+          <w:sz w:val="14"/>
+          <w:szCs w:val="14"/>
+        </w:rPr>
+        <w:t xml:space="preserve"> — Content Generation</w:t>
+      </w:r>
+      <w:r>
+        <w:rPr>
+          <w:rFonts w:ascii="DM Sans" w:cs="DM Sans" w:eastAsia="DM Sans" w:hAnsi="DM Sans"/>
+          <w:b w:val="false"/>
+          <w:bCs w:val="false"/>
+          <w:i w:val="false"/>
+          <w:iCs w:val="false"/>
+          <w:color w:val="444444"/>
+          <w:sz w:val="15"/>
+          <w:szCs w:val="15"/>
+        </w:rPr>
+        <w:t xml:space="preserve">    </w:t>
+      </w:r>
+      <w:r>
+        <w:rPr>
+          <w:rFonts w:ascii="DM Sans" w:cs="DM Sans" w:eastAsia="DM Sans" w:hAnsi="DM Sans"/>
+          <w:b/>
+          <w:bCs/>
+          <w:i w:val="false"/>
+          <w:iCs w:val="false"/>
+          <w:color w:val="2F7D4F"/>
+          <w:sz w:val="15"/>
+          <w:szCs w:val="15"/>
+        </w:rPr>
+        <w:t xml:space="preserve">■ </w:t>
+      </w:r>
+      <w:r>
+        <w:rPr>
+          <w:rFonts w:ascii="DM Sans" w:cs="DM Sans" w:eastAsia="DM Sans" w:hAnsi="DM Sans"/>
+          <w:b/>
+          <w:bCs/>
+          <w:i w:val="false"/>
+          <w:iCs w:val="false"/>
+          <w:color w:val="166534"/>
+          <w:sz w:val="15"/>
+          <w:szCs w:val="15"/>
+        </w:rPr>
+        <w:t xml:space="preserve">Transaction</w:t>
+      </w:r>
+      <w:r>
+        <w:rPr>
+          <w:rFonts w:ascii="DM Sans" w:cs="DM Sans" w:eastAsia="DM Sans" w:hAnsi="DM Sans"/>
+          <w:b w:val="false"/>
+          <w:bCs w:val="false"/>
+          <w:i/>
+          <w:iCs/>
+          <w:color w:val="888888"/>
+          <w:sz w:val="14"/>
+          <w:szCs w:val="14"/>
+        </w:rPr>
+        <w:t xml:space="preserve"> — Rules-Based Processing</w:t>
+      </w:r>
+      <w:r>
+        <w:rPr>
+          <w:rFonts w:ascii="DM Sans" w:cs="DM Sans" w:eastAsia="DM Sans" w:hAnsi="DM Sans"/>
+          <w:b w:val="false"/>
+          <w:bCs w:val="false"/>
+          <w:i w:val="false"/>
+          <w:iCs w:val="false"/>
+          <w:color w:val="444444"/>
+          <w:sz w:val="15"/>
+          <w:szCs w:val="15"/>
+        </w:rPr>
+        <w:t xml:space="preserve">    </w:t>
+      </w:r>
+      <w:r>
+        <w:rPr>
+          <w:rFonts w:ascii="DM Sans" w:cs="DM Sans" w:eastAsia="DM Sans" w:hAnsi="DM Sans"/>
+          <w:b/>
+          <w:bCs/>
+          <w:i w:val="false"/>
+          <w:iCs w:val="false"/>
+          <w:color w:val="8B2635"/>
+          <w:sz w:val="15"/>
+          <w:szCs w:val="15"/>
+        </w:rPr>
+        <w:t xml:space="preserve">■ </w:t>
+      </w:r>
+      <w:r>
+        <w:rPr>
+          <w:rFonts w:ascii="DM Sans" w:cs="DM Sans" w:eastAsia="DM Sans" w:hAnsi="DM Sans"/>
+          <w:b/>
+          <w:bCs/>
+          <w:i w:val="false"/>
+          <w:iCs w:val="false"/>
+          <w:color w:val="991B1B"/>
+          <w:sz w:val="15"/>
+          <w:szCs w:val="15"/>
+        </w:rPr>
+        <w:t xml:space="preserve">Exception</w:t>
+      </w:r>
+      <w:r>
+        <w:rPr>
+          <w:rFonts w:ascii="DM Sans" w:cs="DM Sans" w:eastAsia="DM Sans" w:hAnsi="DM Sans"/>
+          <w:b w:val="false"/>
+          <w:bCs w:val="false"/>
+          <w:i/>
+          <w:iCs/>
+          <w:color w:val="888888"/>
+          <w:sz w:val="14"/>
+          <w:szCs w:val="14"/>
+        </w:rPr>
+        <w:t xml:space="preserve"> — Non-Standard Resolution</w:t>
+      </w:r>
+    </w:p>
+    <w:p>
+      <w:pPr>
+        <w:spacing w:after="180" w:before="0"/>
+      </w:pPr>
+      <w:r>
+        <w:rPr>
+          <w:rFonts w:ascii="DM Sans" w:cs="DM Sans" w:eastAsia="DM Sans" w:hAnsi="DM Sans"/>
+          <w:b w:val="false"/>
+          <w:bCs w:val="false"/>
+          <w:i/>
+          <w:iCs/>
+          <w:color w:val="8A8A8C"/>
+          <w:sz w:val="14"/>
+          <w:szCs w:val="14"/>
+        </w:rPr>
+        <w:t xml:space="preserve">Canonical pattern legend — one fixed color-and-label mapping used across every role and document in the framework, matching the live dashboard’s own legend.</w:t>
       </w:r>
     </w:p>
     <w:tbl>
@@ -292,7 +562,19 @@
         </w:trPr>
         <w:tc>
           <w:tcPr>
-            <w:tcW w:type="dxa" w:w="3860"/>
+            <w:tcW w:type="dxa" w:w="260"/>
+            <w:tcMar>
+              <w:top w:type="dxa" w:w="80"/>
+              <w:left w:type="dxa" w:w="0"/>
+              <w:bottom w:type="dxa" w:w="80"/>
+              <w:right w:type="dxa" w:w="0"/>
+            </w:tcMar>
+          </w:tcPr>
+          <w:p/>
+        </w:tc>
+        <w:tc>
+          <w:tcPr>
+            <w:tcW w:type="dxa" w:w="3600"/>
             <w:tcMar>
               <w:top w:type="dxa" w:w="90"/>
               <w:left w:type="dxa" w:w="120"/>
@@ -323,15 +605,15 @@
           <w:tcPr>
             <w:tcW w:type="dxa" w:w="2060"/>
             <w:tcMar>
-              <w:top w:type="dxa" w:w="90"/>
-              <w:left w:type="dxa" w:w="120"/>
-              <w:bottom w:type="dxa" w:w="90"/>
-              <w:right w:type="dxa" w:w="120"/>
+              <w:top w:type="dxa" w:w="80"/>
+              <w:left w:type="dxa" w:w="100"/>
+              <w:bottom w:type="dxa" w:w="80"/>
+              <w:right w:type="dxa" w:w="100"/>
             </w:tcMar>
           </w:tcPr>
           <w:p>
             <w:pPr>
-              <w:spacing w:after="0" w:before="0"/>
+              <w:spacing w:after="20" w:before="0"/>
               <w:jc w:val="center"/>
             </w:pPr>
             <w:r>
@@ -342,10 +624,29 @@
                 <w:i w:val="false"/>
                 <w:iCs w:val="false"/>
                 <w:color w:val="1B4F8A"/>
-                <w:sz w:val="15"/>
-                <w:szCs w:val="15"/>
+                <w:sz w:val="14"/>
+                <w:szCs w:val="14"/>
               </w:rPr>
-              <w:t xml:space="preserve">M1 · Current</w:t>
+              <w:t xml:space="preserve">M1 — Undesigned</w:t>
+            </w:r>
+          </w:p>
+          <w:p>
+            <w:pPr>
+              <w:spacing w:after="0" w:before="0"/>
+              <w:jc w:val="center"/>
+            </w:pPr>
+            <w:r>
+              <w:rPr>
+                <w:rFonts w:ascii="DM Sans" w:cs="DM Sans" w:eastAsia="DM Sans" w:hAnsi="DM Sans"/>
+                <w:b w:val="false"/>
+                <w:bCs w:val="false"/>
+                <w:i/>
+                <w:iCs/>
+                <w:color w:val="1B4F8A"/>
+                <w:sz w:val="13"/>
+                <w:szCs w:val="13"/>
+              </w:rPr>
+              <w:t xml:space="preserve">Current state</w:t>
             </w:r>
           </w:p>
         </w:tc>
@@ -353,15 +654,15 @@
           <w:tcPr>
             <w:tcW w:type="dxa" w:w="2060"/>
             <w:tcMar>
-              <w:top w:type="dxa" w:w="90"/>
-              <w:left w:type="dxa" w:w="120"/>
-              <w:bottom w:type="dxa" w:w="90"/>
-              <w:right w:type="dxa" w:w="120"/>
+              <w:top w:type="dxa" w:w="80"/>
+              <w:left w:type="dxa" w:w="100"/>
+              <w:bottom w:type="dxa" w:w="80"/>
+              <w:right w:type="dxa" w:w="100"/>
             </w:tcMar>
           </w:tcPr>
           <w:p>
             <w:pPr>
-              <w:spacing w:after="0" w:before="0"/>
+              <w:spacing w:after="20" w:before="0"/>
               <w:jc w:val="center"/>
             </w:pPr>
             <w:r>
@@ -372,10 +673,29 @@
                 <w:i w:val="false"/>
                 <w:iCs w:val="false"/>
                 <w:color w:val="1B4F8A"/>
-                <w:sz w:val="15"/>
-                <w:szCs w:val="15"/>
+                <w:sz w:val="14"/>
+                <w:szCs w:val="14"/>
               </w:rPr>
-              <w:t xml:space="preserve">M3 · Target</w:t>
+              <w:t xml:space="preserve">M3 — HITL Design Intent</w:t>
+            </w:r>
+          </w:p>
+          <w:p>
+            <w:pPr>
+              <w:spacing w:after="0" w:before="0"/>
+              <w:jc w:val="center"/>
+            </w:pPr>
+            <w:r>
+              <w:rPr>
+                <w:rFonts w:ascii="DM Sans" w:cs="DM Sans" w:eastAsia="DM Sans" w:hAnsi="DM Sans"/>
+                <w:b w:val="false"/>
+                <w:bCs w:val="false"/>
+                <w:i/>
+                <w:iCs/>
+                <w:color w:val="1B4F8A"/>
+                <w:sz w:val="13"/>
+                <w:szCs w:val="13"/>
+              </w:rPr>
+              <w:t xml:space="preserve">Target state</w:t>
             </w:r>
           </w:p>
         </w:tc>
@@ -383,15 +703,15 @@
           <w:tcPr>
             <w:tcW w:type="dxa" w:w="2060"/>
             <w:tcMar>
-              <w:top w:type="dxa" w:w="90"/>
-              <w:left w:type="dxa" w:w="120"/>
-              <w:bottom w:type="dxa" w:w="90"/>
-              <w:right w:type="dxa" w:w="120"/>
+              <w:top w:type="dxa" w:w="80"/>
+              <w:left w:type="dxa" w:w="100"/>
+              <w:bottom w:type="dxa" w:w="80"/>
+              <w:right w:type="dxa" w:w="100"/>
             </w:tcMar>
           </w:tcPr>
           <w:p>
             <w:pPr>
-              <w:spacing w:after="0" w:before="0"/>
+              <w:spacing w:after="20" w:before="0"/>
               <w:jc w:val="center"/>
             </w:pPr>
             <w:r>
@@ -402,10 +722,29 @@
                 <w:i w:val="false"/>
                 <w:iCs w:val="false"/>
                 <w:color w:val="1B4F8A"/>
-                <w:sz w:val="15"/>
-                <w:szCs w:val="15"/>
+                <w:sz w:val="14"/>
+                <w:szCs w:val="14"/>
               </w:rPr>
-              <w:t xml:space="preserve">M5 · Future</w:t>
+              <w:t xml:space="preserve">M5 — Leading</w:t>
+            </w:r>
+          </w:p>
+          <w:p>
+            <w:pPr>
+              <w:spacing w:after="0" w:before="0"/>
+              <w:jc w:val="center"/>
+            </w:pPr>
+            <w:r>
+              <w:rPr>
+                <w:rFonts w:ascii="DM Sans" w:cs="DM Sans" w:eastAsia="DM Sans" w:hAnsi="DM Sans"/>
+                <w:b w:val="false"/>
+                <w:bCs w:val="false"/>
+                <w:i/>
+                <w:iCs/>
+                <w:color w:val="1B4F8A"/>
+                <w:sz w:val="13"/>
+                <w:szCs w:val="13"/>
+              </w:rPr>
+              <w:t xml:space="preserve">Future state</w:t>
             </w:r>
           </w:p>
         </w:tc>

</xml_diff>

<commit_message>
add ms work only fonts
</commit_message>
<xml_diff>
--- a/docs/wip/CHRO_Pattern_Transition_Narrative.docx
+++ b/docs/wip/CHRO_Pattern_Transition_Narrative.docx
@@ -37,7 +37,7 @@
             </w:pPr>
             <w:r>
               <w:rPr>
-                <w:rFonts w:ascii="Playfair Display" w:cs="Playfair Display" w:eastAsia="Playfair Display" w:hAnsi="Playfair Display"/>
+                <w:rFonts w:ascii="Georgia" w:cs="Georgia" w:eastAsia="Georgia" w:hAnsi="Georgia"/>
                 <w:b/>
                 <w:bCs/>
                 <w:i w:val="false"/>
@@ -56,7 +56,7 @@
             </w:pPr>
             <w:r>
               <w:rPr>
-                <w:rFonts w:ascii="Playfair Display" w:cs="Playfair Display" w:eastAsia="Playfair Display" w:hAnsi="Playfair Display"/>
+                <w:rFonts w:ascii="Georgia" w:cs="Georgia" w:eastAsia="Georgia" w:hAnsi="Georgia"/>
                 <w:b w:val="false"/>
                 <w:bCs w:val="false"/>
                 <w:i/>
@@ -115,7 +115,7 @@
             </w:pPr>
             <w:r>
               <w:rPr>
-                <w:rFonts w:ascii="DM Sans" w:cs="DM Sans" w:eastAsia="DM Sans" w:hAnsi="DM Sans"/>
+                <w:rFonts w:ascii="Segoe UI" w:cs="Segoe UI" w:eastAsia="Segoe UI" w:hAnsi="Segoe UI"/>
                 <w:b w:val="false"/>
                 <w:bCs w:val="false"/>
                 <w:i/>
@@ -136,7 +136,7 @@
       </w:pPr>
       <w:r>
         <w:rPr>
-          <w:rFonts w:ascii="Playfair Display" w:cs="Playfair Display" w:eastAsia="Playfair Display" w:hAnsi="Playfair Display"/>
+          <w:rFonts w:ascii="Georgia" w:cs="Georgia" w:eastAsia="Georgia" w:hAnsi="Georgia"/>
           <w:b/>
           <w:bCs/>
           <w:i w:val="false"/>
@@ -154,7 +154,7 @@
       </w:pPr>
       <w:r>
         <w:rPr>
-          <w:rFonts w:ascii="DM Sans" w:cs="DM Sans" w:eastAsia="DM Sans" w:hAnsi="DM Sans"/>
+          <w:rFonts w:ascii="Segoe UI" w:cs="Segoe UI" w:eastAsia="Segoe UI" w:hAnsi="Segoe UI"/>
           <w:b w:val="false"/>
           <w:bCs w:val="false"/>
           <w:i/>
@@ -172,7 +172,7 @@
       </w:pPr>
       <w:r>
         <w:rPr>
-          <w:rFonts w:ascii="DM Sans" w:cs="DM Sans" w:eastAsia="DM Sans" w:hAnsi="DM Sans"/>
+          <w:rFonts w:ascii="Segoe UI" w:cs="Segoe UI" w:eastAsia="Segoe UI" w:hAnsi="Segoe UI"/>
           <w:b w:val="false"/>
           <w:bCs w:val="false"/>
           <w:i w:val="false"/>
@@ -193,7 +193,7 @@
       </w:pPr>
       <w:r>
         <w:rPr>
-          <w:rFonts w:ascii="DM Sans" w:cs="DM Sans" w:eastAsia="DM Sans" w:hAnsi="DM Sans"/>
+          <w:rFonts w:ascii="Segoe UI" w:cs="Segoe UI" w:eastAsia="Segoe UI" w:hAnsi="Segoe UI"/>
           <w:b/>
           <w:bCs/>
           <w:i w:val="false"/>
@@ -211,7 +211,7 @@
       </w:pPr>
       <w:r>
         <w:rPr>
-          <w:rFonts w:ascii="DM Sans" w:cs="DM Sans" w:eastAsia="DM Sans" w:hAnsi="DM Sans"/>
+          <w:rFonts w:ascii="Segoe UI" w:cs="Segoe UI" w:eastAsia="Segoe UI" w:hAnsi="Segoe UI"/>
           <w:b w:val="false"/>
           <w:bCs w:val="false"/>
           <w:i/>
@@ -237,7 +237,7 @@
       </w:pPr>
       <w:r>
         <w:rPr>
-          <w:rFonts w:ascii="DM Sans" w:cs="DM Sans" w:eastAsia="DM Sans" w:hAnsi="DM Sans"/>
+          <w:rFonts w:ascii="Segoe UI" w:cs="Segoe UI" w:eastAsia="Segoe UI" w:hAnsi="Segoe UI"/>
           <w:b/>
           <w:bCs/>
           <w:i w:val="false"/>
@@ -255,7 +255,7 @@
       </w:pPr>
       <w:r>
         <w:rPr>
-          <w:rFonts w:ascii="DM Sans" w:cs="DM Sans" w:eastAsia="DM Sans" w:hAnsi="DM Sans"/>
+          <w:rFonts w:ascii="Segoe UI" w:cs="Segoe UI" w:eastAsia="Segoe UI" w:hAnsi="Segoe UI"/>
           <w:b w:val="false"/>
           <w:bCs w:val="false"/>
           <w:i/>
@@ -273,7 +273,7 @@
       </w:pPr>
       <w:r>
         <w:rPr>
-          <w:rFonts w:ascii="DM Sans" w:cs="DM Sans" w:eastAsia="DM Sans" w:hAnsi="DM Sans"/>
+          <w:rFonts w:ascii="Segoe UI" w:cs="Segoe UI" w:eastAsia="Segoe UI" w:hAnsi="Segoe UI"/>
           <w:b/>
           <w:bCs/>
           <w:i w:val="false"/>
@@ -286,7 +286,7 @@
       </w:r>
       <w:r>
         <w:rPr>
-          <w:rFonts w:ascii="DM Sans" w:cs="DM Sans" w:eastAsia="DM Sans" w:hAnsi="DM Sans"/>
+          <w:rFonts w:ascii="Segoe UI" w:cs="Segoe UI" w:eastAsia="Segoe UI" w:hAnsi="Segoe UI"/>
           <w:b/>
           <w:bCs/>
           <w:i w:val="false"/>
@@ -299,7 +299,7 @@
       </w:r>
       <w:r>
         <w:rPr>
-          <w:rFonts w:ascii="DM Sans" w:cs="DM Sans" w:eastAsia="DM Sans" w:hAnsi="DM Sans"/>
+          <w:rFonts w:ascii="Segoe UI" w:cs="Segoe UI" w:eastAsia="Segoe UI" w:hAnsi="Segoe UI"/>
           <w:b w:val="false"/>
           <w:bCs w:val="false"/>
           <w:i/>
@@ -312,7 +312,7 @@
       </w:r>
       <w:r>
         <w:rPr>
-          <w:rFonts w:ascii="DM Sans" w:cs="DM Sans" w:eastAsia="DM Sans" w:hAnsi="DM Sans"/>
+          <w:rFonts w:ascii="Segoe UI" w:cs="Segoe UI" w:eastAsia="Segoe UI" w:hAnsi="Segoe UI"/>
           <w:b w:val="false"/>
           <w:bCs w:val="false"/>
           <w:i w:val="false"/>
@@ -325,7 +325,7 @@
       </w:r>
       <w:r>
         <w:rPr>
-          <w:rFonts w:ascii="DM Sans" w:cs="DM Sans" w:eastAsia="DM Sans" w:hAnsi="DM Sans"/>
+          <w:rFonts w:ascii="Segoe UI" w:cs="Segoe UI" w:eastAsia="Segoe UI" w:hAnsi="Segoe UI"/>
           <w:b/>
           <w:bCs/>
           <w:i w:val="false"/>
@@ -338,7 +338,7 @@
       </w:r>
       <w:r>
         <w:rPr>
-          <w:rFonts w:ascii="DM Sans" w:cs="DM Sans" w:eastAsia="DM Sans" w:hAnsi="DM Sans"/>
+          <w:rFonts w:ascii="Segoe UI" w:cs="Segoe UI" w:eastAsia="Segoe UI" w:hAnsi="Segoe UI"/>
           <w:b/>
           <w:bCs/>
           <w:i w:val="false"/>
@@ -351,7 +351,7 @@
       </w:r>
       <w:r>
         <w:rPr>
-          <w:rFonts w:ascii="DM Sans" w:cs="DM Sans" w:eastAsia="DM Sans" w:hAnsi="DM Sans"/>
+          <w:rFonts w:ascii="Segoe UI" w:cs="Segoe UI" w:eastAsia="Segoe UI" w:hAnsi="Segoe UI"/>
           <w:b w:val="false"/>
           <w:bCs w:val="false"/>
           <w:i/>
@@ -364,7 +364,7 @@
       </w:r>
       <w:r>
         <w:rPr>
-          <w:rFonts w:ascii="DM Sans" w:cs="DM Sans" w:eastAsia="DM Sans" w:hAnsi="DM Sans"/>
+          <w:rFonts w:ascii="Segoe UI" w:cs="Segoe UI" w:eastAsia="Segoe UI" w:hAnsi="Segoe UI"/>
           <w:b w:val="false"/>
           <w:bCs w:val="false"/>
           <w:i w:val="false"/>
@@ -377,7 +377,7 @@
       </w:r>
       <w:r>
         <w:rPr>
-          <w:rFonts w:ascii="DM Sans" w:cs="DM Sans" w:eastAsia="DM Sans" w:hAnsi="DM Sans"/>
+          <w:rFonts w:ascii="Segoe UI" w:cs="Segoe UI" w:eastAsia="Segoe UI" w:hAnsi="Segoe UI"/>
           <w:b/>
           <w:bCs/>
           <w:i w:val="false"/>
@@ -390,7 +390,7 @@
       </w:r>
       <w:r>
         <w:rPr>
-          <w:rFonts w:ascii="DM Sans" w:cs="DM Sans" w:eastAsia="DM Sans" w:hAnsi="DM Sans"/>
+          <w:rFonts w:ascii="Segoe UI" w:cs="Segoe UI" w:eastAsia="Segoe UI" w:hAnsi="Segoe UI"/>
           <w:b/>
           <w:bCs/>
           <w:i w:val="false"/>
@@ -403,7 +403,7 @@
       </w:r>
       <w:r>
         <w:rPr>
-          <w:rFonts w:ascii="DM Sans" w:cs="DM Sans" w:eastAsia="DM Sans" w:hAnsi="DM Sans"/>
+          <w:rFonts w:ascii="Segoe UI" w:cs="Segoe UI" w:eastAsia="Segoe UI" w:hAnsi="Segoe UI"/>
           <w:b w:val="false"/>
           <w:bCs w:val="false"/>
           <w:i/>
@@ -416,7 +416,7 @@
       </w:r>
       <w:r>
         <w:rPr>
-          <w:rFonts w:ascii="DM Sans" w:cs="DM Sans" w:eastAsia="DM Sans" w:hAnsi="DM Sans"/>
+          <w:rFonts w:ascii="Segoe UI" w:cs="Segoe UI" w:eastAsia="Segoe UI" w:hAnsi="Segoe UI"/>
           <w:b w:val="false"/>
           <w:bCs w:val="false"/>
           <w:i w:val="false"/>
@@ -429,7 +429,7 @@
       </w:r>
       <w:r>
         <w:rPr>
-          <w:rFonts w:ascii="DM Sans" w:cs="DM Sans" w:eastAsia="DM Sans" w:hAnsi="DM Sans"/>
+          <w:rFonts w:ascii="Segoe UI" w:cs="Segoe UI" w:eastAsia="Segoe UI" w:hAnsi="Segoe UI"/>
           <w:b/>
           <w:bCs/>
           <w:i w:val="false"/>
@@ -442,7 +442,7 @@
       </w:r>
       <w:r>
         <w:rPr>
-          <w:rFonts w:ascii="DM Sans" w:cs="DM Sans" w:eastAsia="DM Sans" w:hAnsi="DM Sans"/>
+          <w:rFonts w:ascii="Segoe UI" w:cs="Segoe UI" w:eastAsia="Segoe UI" w:hAnsi="Segoe UI"/>
           <w:b/>
           <w:bCs/>
           <w:i w:val="false"/>
@@ -455,7 +455,7 @@
       </w:r>
       <w:r>
         <w:rPr>
-          <w:rFonts w:ascii="DM Sans" w:cs="DM Sans" w:eastAsia="DM Sans" w:hAnsi="DM Sans"/>
+          <w:rFonts w:ascii="Segoe UI" w:cs="Segoe UI" w:eastAsia="Segoe UI" w:hAnsi="Segoe UI"/>
           <w:b w:val="false"/>
           <w:bCs w:val="false"/>
           <w:i/>
@@ -468,7 +468,7 @@
       </w:r>
       <w:r>
         <w:rPr>
-          <w:rFonts w:ascii="DM Sans" w:cs="DM Sans" w:eastAsia="DM Sans" w:hAnsi="DM Sans"/>
+          <w:rFonts w:ascii="Segoe UI" w:cs="Segoe UI" w:eastAsia="Segoe UI" w:hAnsi="Segoe UI"/>
           <w:b w:val="false"/>
           <w:bCs w:val="false"/>
           <w:i w:val="false"/>
@@ -481,7 +481,7 @@
       </w:r>
       <w:r>
         <w:rPr>
-          <w:rFonts w:ascii="DM Sans" w:cs="DM Sans" w:eastAsia="DM Sans" w:hAnsi="DM Sans"/>
+          <w:rFonts w:ascii="Segoe UI" w:cs="Segoe UI" w:eastAsia="Segoe UI" w:hAnsi="Segoe UI"/>
           <w:b/>
           <w:bCs/>
           <w:i w:val="false"/>
@@ -494,7 +494,7 @@
       </w:r>
       <w:r>
         <w:rPr>
-          <w:rFonts w:ascii="DM Sans" w:cs="DM Sans" w:eastAsia="DM Sans" w:hAnsi="DM Sans"/>
+          <w:rFonts w:ascii="Segoe UI" w:cs="Segoe UI" w:eastAsia="Segoe UI" w:hAnsi="Segoe UI"/>
           <w:b/>
           <w:bCs/>
           <w:i w:val="false"/>
@@ -507,7 +507,7 @@
       </w:r>
       <w:r>
         <w:rPr>
-          <w:rFonts w:ascii="DM Sans" w:cs="DM Sans" w:eastAsia="DM Sans" w:hAnsi="DM Sans"/>
+          <w:rFonts w:ascii="Segoe UI" w:cs="Segoe UI" w:eastAsia="Segoe UI" w:hAnsi="Segoe UI"/>
           <w:b w:val="false"/>
           <w:bCs w:val="false"/>
           <w:i/>
@@ -525,7 +525,7 @@
       </w:pPr>
       <w:r>
         <w:rPr>
-          <w:rFonts w:ascii="DM Sans" w:cs="DM Sans" w:eastAsia="DM Sans" w:hAnsi="DM Sans"/>
+          <w:rFonts w:ascii="Segoe UI" w:cs="Segoe UI" w:eastAsia="Segoe UI" w:hAnsi="Segoe UI"/>
           <w:b w:val="false"/>
           <w:bCs w:val="false"/>
           <w:i/>
@@ -588,7 +588,7 @@
             </w:pPr>
             <w:r>
               <w:rPr>
-                <w:rFonts w:ascii="DM Mono" w:cs="DM Mono" w:eastAsia="DM Mono" w:hAnsi="DM Mono"/>
+                <w:rFonts w:ascii="Consolas" w:cs="Consolas" w:eastAsia="Consolas" w:hAnsi="Consolas"/>
                 <w:b/>
                 <w:bCs/>
                 <w:i w:val="false"/>
@@ -618,7 +618,7 @@
             </w:pPr>
             <w:r>
               <w:rPr>
-                <w:rFonts w:ascii="DM Mono" w:cs="DM Mono" w:eastAsia="DM Mono" w:hAnsi="DM Mono"/>
+                <w:rFonts w:ascii="Consolas" w:cs="Consolas" w:eastAsia="Consolas" w:hAnsi="Consolas"/>
                 <w:b/>
                 <w:bCs/>
                 <w:i w:val="false"/>
@@ -637,7 +637,7 @@
             </w:pPr>
             <w:r>
               <w:rPr>
-                <w:rFonts w:ascii="DM Sans" w:cs="DM Sans" w:eastAsia="DM Sans" w:hAnsi="DM Sans"/>
+                <w:rFonts w:ascii="Segoe UI" w:cs="Segoe UI" w:eastAsia="Segoe UI" w:hAnsi="Segoe UI"/>
                 <w:b w:val="false"/>
                 <w:bCs w:val="false"/>
                 <w:i/>
@@ -667,7 +667,7 @@
             </w:pPr>
             <w:r>
               <w:rPr>
-                <w:rFonts w:ascii="DM Mono" w:cs="DM Mono" w:eastAsia="DM Mono" w:hAnsi="DM Mono"/>
+                <w:rFonts w:ascii="Consolas" w:cs="Consolas" w:eastAsia="Consolas" w:hAnsi="Consolas"/>
                 <w:b/>
                 <w:bCs/>
                 <w:i w:val="false"/>
@@ -686,7 +686,7 @@
             </w:pPr>
             <w:r>
               <w:rPr>
-                <w:rFonts w:ascii="DM Sans" w:cs="DM Sans" w:eastAsia="DM Sans" w:hAnsi="DM Sans"/>
+                <w:rFonts w:ascii="Segoe UI" w:cs="Segoe UI" w:eastAsia="Segoe UI" w:hAnsi="Segoe UI"/>
                 <w:b w:val="false"/>
                 <w:bCs w:val="false"/>
                 <w:i/>
@@ -716,7 +716,7 @@
             </w:pPr>
             <w:r>
               <w:rPr>
-                <w:rFonts w:ascii="DM Mono" w:cs="DM Mono" w:eastAsia="DM Mono" w:hAnsi="DM Mono"/>
+                <w:rFonts w:ascii="Consolas" w:cs="Consolas" w:eastAsia="Consolas" w:hAnsi="Consolas"/>
                 <w:b/>
                 <w:bCs/>
                 <w:i w:val="false"/>
@@ -735,7 +735,7 @@
             </w:pPr>
             <w:r>
               <w:rPr>
-                <w:rFonts w:ascii="DM Sans" w:cs="DM Sans" w:eastAsia="DM Sans" w:hAnsi="DM Sans"/>
+                <w:rFonts w:ascii="Segoe UI" w:cs="Segoe UI" w:eastAsia="Segoe UI" w:hAnsi="Segoe UI"/>
                 <w:b w:val="false"/>
                 <w:bCs w:val="false"/>
                 <w:i/>
@@ -779,7 +779,7 @@
             </w:pPr>
             <w:r>
               <w:rPr>
-                <w:rFonts w:ascii="DM Sans" w:cs="DM Sans" w:eastAsia="DM Sans" w:hAnsi="DM Sans"/>
+                <w:rFonts w:ascii="Segoe UI" w:cs="Segoe UI" w:eastAsia="Segoe UI" w:hAnsi="Segoe UI"/>
                 <w:b/>
                 <w:bCs/>
                 <w:i w:val="false"/>
@@ -809,7 +809,7 @@
             </w:pPr>
             <w:r>
               <w:rPr>
-                <w:rFonts w:ascii="DM Sans" w:cs="DM Sans" w:eastAsia="DM Sans" w:hAnsi="DM Sans"/>
+                <w:rFonts w:ascii="Segoe UI" w:cs="Segoe UI" w:eastAsia="Segoe UI" w:hAnsi="Segoe UI"/>
                 <w:b w:val="false"/>
                 <w:bCs w:val="false"/>
                 <w:i w:val="false"/>
@@ -839,7 +839,7 @@
             </w:pPr>
             <w:r>
               <w:rPr>
-                <w:rFonts w:ascii="DM Sans" w:cs="DM Sans" w:eastAsia="DM Sans" w:hAnsi="DM Sans"/>
+                <w:rFonts w:ascii="Segoe UI" w:cs="Segoe UI" w:eastAsia="Segoe UI" w:hAnsi="Segoe UI"/>
                 <w:b w:val="false"/>
                 <w:bCs w:val="false"/>
                 <w:i w:val="false"/>
@@ -869,7 +869,7 @@
             </w:pPr>
             <w:r>
               <w:rPr>
-                <w:rFonts w:ascii="DM Sans" w:cs="DM Sans" w:eastAsia="DM Sans" w:hAnsi="DM Sans"/>
+                <w:rFonts w:ascii="Segoe UI" w:cs="Segoe UI" w:eastAsia="Segoe UI" w:hAnsi="Segoe UI"/>
                 <w:b w:val="false"/>
                 <w:bCs w:val="false"/>
                 <w:i w:val="false"/>
@@ -913,7 +913,7 @@
             </w:pPr>
             <w:r>
               <w:rPr>
-                <w:rFonts w:ascii="DM Sans" w:cs="DM Sans" w:eastAsia="DM Sans" w:hAnsi="DM Sans"/>
+                <w:rFonts w:ascii="Segoe UI" w:cs="Segoe UI" w:eastAsia="Segoe UI" w:hAnsi="Segoe UI"/>
                 <w:b/>
                 <w:bCs/>
                 <w:i w:val="false"/>
@@ -943,7 +943,7 @@
             </w:pPr>
             <w:r>
               <w:rPr>
-                <w:rFonts w:ascii="DM Sans" w:cs="DM Sans" w:eastAsia="DM Sans" w:hAnsi="DM Sans"/>
+                <w:rFonts w:ascii="Segoe UI" w:cs="Segoe UI" w:eastAsia="Segoe UI" w:hAnsi="Segoe UI"/>
                 <w:b w:val="false"/>
                 <w:bCs w:val="false"/>
                 <w:i w:val="false"/>
@@ -973,7 +973,7 @@
             </w:pPr>
             <w:r>
               <w:rPr>
-                <w:rFonts w:ascii="DM Sans" w:cs="DM Sans" w:eastAsia="DM Sans" w:hAnsi="DM Sans"/>
+                <w:rFonts w:ascii="Segoe UI" w:cs="Segoe UI" w:eastAsia="Segoe UI" w:hAnsi="Segoe UI"/>
                 <w:b w:val="false"/>
                 <w:bCs w:val="false"/>
                 <w:i w:val="false"/>
@@ -1003,7 +1003,7 @@
             </w:pPr>
             <w:r>
               <w:rPr>
-                <w:rFonts w:ascii="DM Sans" w:cs="DM Sans" w:eastAsia="DM Sans" w:hAnsi="DM Sans"/>
+                <w:rFonts w:ascii="Segoe UI" w:cs="Segoe UI" w:eastAsia="Segoe UI" w:hAnsi="Segoe UI"/>
                 <w:b w:val="false"/>
                 <w:bCs w:val="false"/>
                 <w:i w:val="false"/>
@@ -1024,7 +1024,7 @@
       </w:pPr>
       <w:r>
         <w:rPr>
-          <w:rFonts w:ascii="DM Sans" w:cs="DM Sans" w:eastAsia="DM Sans" w:hAnsi="DM Sans"/>
+          <w:rFonts w:ascii="Segoe UI" w:cs="Segoe UI" w:eastAsia="Segoe UI" w:hAnsi="Segoe UI"/>
           <w:b w:val="false"/>
           <w:bCs w:val="false"/>
           <w:i/>
@@ -1045,7 +1045,7 @@
       </w:pPr>
       <w:r>
         <w:rPr>
-          <w:rFonts w:ascii="DM Sans" w:cs="DM Sans" w:eastAsia="DM Sans" w:hAnsi="DM Sans"/>
+          <w:rFonts w:ascii="Segoe UI" w:cs="Segoe UI" w:eastAsia="Segoe UI" w:hAnsi="Segoe UI"/>
           <w:b/>
           <w:bCs/>
           <w:i w:val="false"/>
@@ -1063,7 +1063,7 @@
       </w:pPr>
       <w:r>
         <w:rPr>
-          <w:rFonts w:ascii="DM Sans" w:cs="DM Sans" w:eastAsia="DM Sans" w:hAnsi="DM Sans"/>
+          <w:rFonts w:ascii="Segoe UI" w:cs="Segoe UI" w:eastAsia="Segoe UI" w:hAnsi="Segoe UI"/>
           <w:b w:val="false"/>
           <w:bCs w:val="false"/>
           <w:i/>
@@ -1081,7 +1081,7 @@
       </w:pPr>
       <w:r>
         <w:rPr>
-          <w:rFonts w:ascii="DM Sans" w:cs="DM Sans" w:eastAsia="DM Sans" w:hAnsi="DM Sans"/>
+          <w:rFonts w:ascii="Segoe UI" w:cs="Segoe UI" w:eastAsia="Segoe UI" w:hAnsi="Segoe UI"/>
           <w:b/>
           <w:bCs/>
           <w:i w:val="false"/>
@@ -1094,7 +1094,7 @@
       </w:r>
       <w:r>
         <w:rPr>
-          <w:rFonts w:ascii="DM Sans" w:cs="DM Sans" w:eastAsia="DM Sans" w:hAnsi="DM Sans"/>
+          <w:rFonts w:ascii="Segoe UI" w:cs="Segoe UI" w:eastAsia="Segoe UI" w:hAnsi="Segoe UI"/>
           <w:b w:val="false"/>
           <w:bCs w:val="false"/>
           <w:i w:val="false"/>
@@ -1112,7 +1112,7 @@
       </w:pPr>
       <w:r>
         <w:rPr>
-          <w:rFonts w:ascii="DM Sans" w:cs="DM Sans" w:eastAsia="DM Sans" w:hAnsi="DM Sans"/>
+          <w:rFonts w:ascii="Segoe UI" w:cs="Segoe UI" w:eastAsia="Segoe UI" w:hAnsi="Segoe UI"/>
           <w:b w:val="false"/>
           <w:bCs w:val="false"/>
           <w:i w:val="false"/>
@@ -1130,7 +1130,7 @@
       </w:pPr>
       <w:r>
         <w:rPr>
-          <w:rFonts w:ascii="DM Sans" w:cs="DM Sans" w:eastAsia="DM Sans" w:hAnsi="DM Sans"/>
+          <w:rFonts w:ascii="Segoe UI" w:cs="Segoe UI" w:eastAsia="Segoe UI" w:hAnsi="Segoe UI"/>
           <w:b/>
           <w:bCs/>
           <w:i w:val="false"/>
@@ -1143,7 +1143,7 @@
       </w:r>
       <w:r>
         <w:rPr>
-          <w:rFonts w:ascii="DM Sans" w:cs="DM Sans" w:eastAsia="DM Sans" w:hAnsi="DM Sans"/>
+          <w:rFonts w:ascii="Segoe UI" w:cs="Segoe UI" w:eastAsia="Segoe UI" w:hAnsi="Segoe UI"/>
           <w:b w:val="false"/>
           <w:bCs w:val="false"/>
           <w:i w:val="false"/>
@@ -1161,7 +1161,7 @@
       </w:pPr>
       <w:r>
         <w:rPr>
-          <w:rFonts w:ascii="DM Sans" w:cs="DM Sans" w:eastAsia="DM Sans" w:hAnsi="DM Sans"/>
+          <w:rFonts w:ascii="Segoe UI" w:cs="Segoe UI" w:eastAsia="Segoe UI" w:hAnsi="Segoe UI"/>
           <w:b w:val="false"/>
           <w:bCs w:val="false"/>
           <w:i w:val="false"/>
@@ -1182,7 +1182,7 @@
       </w:pPr>
       <w:r>
         <w:rPr>
-          <w:rFonts w:ascii="DM Sans" w:cs="DM Sans" w:eastAsia="DM Sans" w:hAnsi="DM Sans"/>
+          <w:rFonts w:ascii="Segoe UI" w:cs="Segoe UI" w:eastAsia="Segoe UI" w:hAnsi="Segoe UI"/>
           <w:b/>
           <w:bCs/>
           <w:i w:val="false"/>
@@ -1200,7 +1200,7 @@
       </w:pPr>
       <w:r>
         <w:rPr>
-          <w:rFonts w:ascii="DM Sans" w:cs="DM Sans" w:eastAsia="DM Sans" w:hAnsi="DM Sans"/>
+          <w:rFonts w:ascii="Segoe UI" w:cs="Segoe UI" w:eastAsia="Segoe UI" w:hAnsi="Segoe UI"/>
           <w:b w:val="false"/>
           <w:bCs w:val="false"/>
           <w:i/>
@@ -1218,7 +1218,7 @@
       </w:pPr>
       <w:r>
         <w:rPr>
-          <w:rFonts w:ascii="DM Sans" w:cs="DM Sans" w:eastAsia="DM Sans" w:hAnsi="DM Sans"/>
+          <w:rFonts w:ascii="Segoe UI" w:cs="Segoe UI" w:eastAsia="Segoe UI" w:hAnsi="Segoe UI"/>
           <w:b/>
           <w:bCs/>
           <w:i w:val="false"/>
@@ -1231,7 +1231,7 @@
       </w:r>
       <w:r>
         <w:rPr>
-          <w:rFonts w:ascii="DM Sans" w:cs="DM Sans" w:eastAsia="DM Sans" w:hAnsi="DM Sans"/>
+          <w:rFonts w:ascii="Segoe UI" w:cs="Segoe UI" w:eastAsia="Segoe UI" w:hAnsi="Segoe UI"/>
           <w:b w:val="false"/>
           <w:bCs w:val="false"/>
           <w:i w:val="false"/>
@@ -1249,7 +1249,7 @@
       </w:pPr>
       <w:r>
         <w:rPr>
-          <w:rFonts w:ascii="DM Sans" w:cs="DM Sans" w:eastAsia="DM Sans" w:hAnsi="DM Sans"/>
+          <w:rFonts w:ascii="Segoe UI" w:cs="Segoe UI" w:eastAsia="Segoe UI" w:hAnsi="Segoe UI"/>
           <w:b w:val="false"/>
           <w:bCs w:val="false"/>
           <w:i w:val="false"/>
@@ -1267,7 +1267,7 @@
       </w:pPr>
       <w:r>
         <w:rPr>
-          <w:rFonts w:ascii="DM Sans" w:cs="DM Sans" w:eastAsia="DM Sans" w:hAnsi="DM Sans"/>
+          <w:rFonts w:ascii="Segoe UI" w:cs="Segoe UI" w:eastAsia="Segoe UI" w:hAnsi="Segoe UI"/>
           <w:b/>
           <w:bCs/>
           <w:i w:val="false"/>
@@ -1280,7 +1280,7 @@
       </w:r>
       <w:r>
         <w:rPr>
-          <w:rFonts w:ascii="DM Sans" w:cs="DM Sans" w:eastAsia="DM Sans" w:hAnsi="DM Sans"/>
+          <w:rFonts w:ascii="Segoe UI" w:cs="Segoe UI" w:eastAsia="Segoe UI" w:hAnsi="Segoe UI"/>
           <w:b w:val="false"/>
           <w:bCs w:val="false"/>
           <w:i w:val="false"/>
@@ -1298,7 +1298,7 @@
       </w:pPr>
       <w:r>
         <w:rPr>
-          <w:rFonts w:ascii="DM Sans" w:cs="DM Sans" w:eastAsia="DM Sans" w:hAnsi="DM Sans"/>
+          <w:rFonts w:ascii="Segoe UI" w:cs="Segoe UI" w:eastAsia="Segoe UI" w:hAnsi="Segoe UI"/>
           <w:b w:val="false"/>
           <w:bCs w:val="false"/>
           <w:i w:val="false"/>
@@ -1319,7 +1319,7 @@
       </w:pPr>
       <w:r>
         <w:rPr>
-          <w:rFonts w:ascii="DM Sans" w:cs="DM Sans" w:eastAsia="DM Sans" w:hAnsi="DM Sans"/>
+          <w:rFonts w:ascii="Segoe UI" w:cs="Segoe UI" w:eastAsia="Segoe UI" w:hAnsi="Segoe UI"/>
           <w:b/>
           <w:bCs/>
           <w:i w:val="false"/>
@@ -1337,7 +1337,7 @@
       </w:pPr>
       <w:r>
         <w:rPr>
-          <w:rFonts w:ascii="DM Sans" w:cs="DM Sans" w:eastAsia="DM Sans" w:hAnsi="DM Sans"/>
+          <w:rFonts w:ascii="Segoe UI" w:cs="Segoe UI" w:eastAsia="Segoe UI" w:hAnsi="Segoe UI"/>
           <w:b w:val="false"/>
           <w:bCs w:val="false"/>
           <w:i/>
@@ -1355,7 +1355,7 @@
       </w:pPr>
       <w:r>
         <w:rPr>
-          <w:rFonts w:ascii="DM Sans" w:cs="DM Sans" w:eastAsia="DM Sans" w:hAnsi="DM Sans"/>
+          <w:rFonts w:ascii="Segoe UI" w:cs="Segoe UI" w:eastAsia="Segoe UI" w:hAnsi="Segoe UI"/>
           <w:b/>
           <w:bCs/>
           <w:i w:val="false"/>
@@ -1368,7 +1368,7 @@
       </w:r>
       <w:r>
         <w:rPr>
-          <w:rFonts w:ascii="DM Sans" w:cs="DM Sans" w:eastAsia="DM Sans" w:hAnsi="DM Sans"/>
+          <w:rFonts w:ascii="Segoe UI" w:cs="Segoe UI" w:eastAsia="Segoe UI" w:hAnsi="Segoe UI"/>
           <w:b w:val="false"/>
           <w:bCs w:val="false"/>
           <w:i w:val="false"/>
@@ -1386,7 +1386,7 @@
       </w:pPr>
       <w:r>
         <w:rPr>
-          <w:rFonts w:ascii="DM Sans" w:cs="DM Sans" w:eastAsia="DM Sans" w:hAnsi="DM Sans"/>
+          <w:rFonts w:ascii="Segoe UI" w:cs="Segoe UI" w:eastAsia="Segoe UI" w:hAnsi="Segoe UI"/>
           <w:b w:val="false"/>
           <w:bCs w:val="false"/>
           <w:i w:val="false"/>
@@ -1404,7 +1404,7 @@
       </w:pPr>
       <w:r>
         <w:rPr>
-          <w:rFonts w:ascii="DM Sans" w:cs="DM Sans" w:eastAsia="DM Sans" w:hAnsi="DM Sans"/>
+          <w:rFonts w:ascii="Segoe UI" w:cs="Segoe UI" w:eastAsia="Segoe UI" w:hAnsi="Segoe UI"/>
           <w:b/>
           <w:bCs/>
           <w:i w:val="false"/>
@@ -1417,7 +1417,7 @@
       </w:r>
       <w:r>
         <w:rPr>
-          <w:rFonts w:ascii="DM Sans" w:cs="DM Sans" w:eastAsia="DM Sans" w:hAnsi="DM Sans"/>
+          <w:rFonts w:ascii="Segoe UI" w:cs="Segoe UI" w:eastAsia="Segoe UI" w:hAnsi="Segoe UI"/>
           <w:b w:val="false"/>
           <w:bCs w:val="false"/>
           <w:i w:val="false"/>
@@ -1435,7 +1435,7 @@
       </w:pPr>
       <w:r>
         <w:rPr>
-          <w:rFonts w:ascii="DM Sans" w:cs="DM Sans" w:eastAsia="DM Sans" w:hAnsi="DM Sans"/>
+          <w:rFonts w:ascii="Segoe UI" w:cs="Segoe UI" w:eastAsia="Segoe UI" w:hAnsi="Segoe UI"/>
           <w:b w:val="false"/>
           <w:bCs w:val="false"/>
           <w:i w:val="false"/>
@@ -1453,7 +1453,7 @@
       </w:pPr>
       <w:r>
         <w:rPr>
-          <w:rFonts w:ascii="DM Sans" w:cs="DM Sans" w:eastAsia="DM Sans" w:hAnsi="DM Sans"/>
+          <w:rFonts w:ascii="Segoe UI" w:cs="Segoe UI" w:eastAsia="Segoe UI" w:hAnsi="Segoe UI"/>
           <w:b w:val="false"/>
           <w:bCs w:val="false"/>
           <w:i/>
@@ -1471,7 +1471,7 @@
       </w:pPr>
       <w:r>
         <w:rPr>
-          <w:rFonts w:ascii="DM Sans" w:cs="DM Sans" w:eastAsia="DM Sans" w:hAnsi="DM Sans"/>
+          <w:rFonts w:ascii="Segoe UI" w:cs="Segoe UI" w:eastAsia="Segoe UI" w:hAnsi="Segoe UI"/>
           <w:b w:val="false"/>
           <w:bCs w:val="false"/>
           <w:i/>
@@ -1546,7 +1546,7 @@
     </w:pPr>
     <w:r>
       <w:rPr>
-        <w:rFonts w:ascii="DM Sans" w:cs="DM Sans" w:eastAsia="DM Sans" w:hAnsi="DM Sans"/>
+        <w:rFonts w:ascii="Segoe UI" w:cs="Segoe UI" w:eastAsia="Segoe UI" w:hAnsi="Segoe UI"/>
         <w:b w:val="false"/>
         <w:bCs w:val="false"/>
         <w:i w:val="false"/>
@@ -1698,7 +1698,7 @@
   <w:docDefaults>
     <w:rPrDefault>
       <w:rPr>
-        <w:rFonts w:ascii="DM Sans" w:cs="DM Sans" w:eastAsia="DM Sans" w:hAnsi="DM Sans"/>
+        <w:rFonts w:ascii="Segoe UI" w:cs="Segoe UI" w:eastAsia="Segoe UI" w:hAnsi="Segoe UI"/>
         <w:color w:val="444444"/>
         <w:sz w:val="18"/>
         <w:szCs w:val="18"/>

</xml_diff>